<commit_message>
Ch5.3: add decisive platform evidence — only ~20 of 334,976 panelists eligible (prevalence ~6/100k), $28/hr effective rate rules out pricing; recovery plan updated (submissions already approved, stop study to release ~$980)
Co-Authored-By: Claude Fable 5 <noreply@anthropic.com>
Claude-Session: https://claude.ai/code/session_019uQWfMoV11me5yJ6LYRtPv
</commit_message>
<xml_diff>
--- a/dba/00_Execution/Prolific_Recovery_Plan.docx
+++ b/dba/00_Execution/Prolific_Recovery_Plan.docx
@@ -15,7 +15,7 @@
         <w:pStyle w:val="Heading2"/>
       </w:pPr>
       <w:r>
-        <w:t>What the workspace shows (verified from account, Jul 23)</w:t>
+        <w:t>What the workspace shows (verified from account, Jul 23 — updated with study page)</w:t>
       </w:r>
     </w:p>
     <w:p>
@@ -32,16 +32,61 @@
         <w:t>"Audit Professional Judgment Survey (Academic Research)"</w:t>
       </w:r>
       <w:r>
-        <w:t xml:space="preserve"> — created Jul 10, 2026, </w:t>
+        <w:t xml:space="preserve"> — published Jul 15, 2026, </w:t>
       </w:r>
       <w:r>
         <w:rPr>
           <w:b/>
         </w:rPr>
-        <w:t>still ACTIVE at 2%</w:t>
+        <w:t>still ACTIVE</w:t>
       </w:r>
       <w:r>
-        <w:t xml:space="preserve"> (2 of 100 places filled in 13 days).</w:t>
+        <w:t>, 2 of 100 places filled in 8 days of fielding.</w:t>
+      </w:r>
+    </w:p>
+    <w:p>
+      <w:pPr>
+        <w:pStyle w:val="ListBullet"/>
+      </w:pPr>
+      <w:r>
+        <w:rPr>
+          <w:b/>
+        </w:rPr>
+        <w:t>🔑 THE KEY NUMBER: "Eligible participants: 20 of 334,976."</w:t>
+      </w:r>
+      <w:r>
+        <w:t xml:space="preserve"> Prolific's own screening says only ~20 people on the entire platform match the study's criteria (US + audit role + multi-year engagements) — prevalence ≈ 6 per 100,000. The study could never have filled 100 seats. This is now cited (as aggregate platform data) in manuscript Ch. 5.3.</w:t>
+      </w:r>
+    </w:p>
+    <w:p>
+      <w:pPr>
+        <w:pStyle w:val="ListBullet"/>
+      </w:pPr>
+      <w:r>
+        <w:t xml:space="preserve">Effective average reward: </w:t>
+      </w:r>
+      <w:r>
+        <w:rPr>
+          <w:b/>
+        </w:rPr>
+        <w:t>$28.00/hr</w:t>
+      </w:r>
+      <w:r>
+        <w:t>, median completion ~15 min — compensation was generous; price was not the problem.</w:t>
+      </w:r>
+    </w:p>
+    <w:p>
+      <w:pPr>
+        <w:pStyle w:val="ListBullet"/>
+      </w:pPr>
+      <w:r>
+        <w:rPr>
+          <w:b/>
+        </w:rPr>
+        <w:t>Both completed submissions are already APPROVED</w:t>
+      </w:r>
+      <w:r>
+        <w:t xml:space="preserve"> (participants paid — IRB obligation ✅ done). 3 others returned (started, didn't finish).</w:t>
       </w:r>
     </w:p>
     <w:p>
@@ -58,24 +103,7 @@
         <w:t>available balance: $1.67</w:t>
       </w:r>
       <w:r>
-        <w:t xml:space="preserve"> — i.e., nearly the full ~$1,000 outlay is escrowed inside the still-running study, not spent and not lost.</w:t>
-      </w:r>
-    </w:p>
-    <w:p>
-      <w:pPr>
-        <w:pStyle w:val="ListBullet"/>
-      </w:pPr>
-      <w:r>
-        <w:t xml:space="preserve">Prolific only charges for </w:t>
-      </w:r>
-      <w:r>
-        <w:rPr>
-          <w:b/>
-        </w:rPr>
-        <w:t>approved submissions</w:t>
-      </w:r>
-      <w:r>
-        <w:t>. Unfilled places are never charged; stopping the study releases the committed budget back to the workspace balance, which can then be withdrawn/refunded or kept as credit.</w:t>
+        <w:t xml:space="preserve"> — nearly the full ~$1,000 outlay is escrowed inside the still-running study, not spent and not lost. Prolific charges only for approved submissions; stopping the study releases the committed budget back to the balance.</w:t>
       </w:r>
     </w:p>
     <w:p>
@@ -83,12 +111,12 @@
         <w:pStyle w:val="Heading2"/>
       </w:pPr>
       <w:r>
-        <w:t>Why the study didn't fill (the honest diagnosis)</w:t>
+        <w:t>Why the study didn't fill (now proven, not inferred)</w:t>
       </w:r>
     </w:p>
     <w:p>
       <w:r>
-        <w:t>The screeners (US-based + current/recent audit role + multi-year engagement experience) select a sliver of Prolific's pool, and the platform's prevalence for practicing auditors is tiny. At 2 completions in 13 days, the fill rate won't materially improve by waiting — the population isn't there. This matches the manuscript's Chapter 5 finding and is not a pricing problem ($6 for ~18 min ≈ $20/hr is a fair academic rate).</w:t>
+        <w:t>20 eligible participants ≠ 100 target. Arithmetic, not execution. Waiting longer cannot fix a pool of 20.</w:t>
       </w:r>
     </w:p>
     <w:p>
@@ -96,7 +124,7 @@
         <w:pStyle w:val="Heading2"/>
       </w:pPr>
       <w:r>
-        <w:t>Recommended actions — in order, ~15 minutes total</w:t>
+        <w:t>Recommended actions — in order, ~10 minutes total</w:t>
       </w:r>
     </w:p>
     <w:p>
@@ -107,10 +135,10 @@
         <w:rPr>
           <w:b/>
         </w:rPr>
-        <w:t>PAUSE/STOP the study today.</w:t>
+        <w:t>STOP the study today.</w:t>
       </w:r>
       <w:r>
-        <w:t xml:space="preserve"> Studies page → the active study → Pause (then Stop). Data collection is closed for the paper anyway (per Ch. 5); an active study now only delays fund recovery.</w:t>
+        <w:t xml:space="preserve"> Study page → Action menu → Pause / Stop. Data collection is closed for the paper anyway (per Ch. 5); an active study now only delays fund recovery.</w:t>
       </w:r>
     </w:p>
     <w:p>
@@ -126,13 +154,16 @@
         <w:pStyle w:val="ListNumber"/>
       </w:pPr>
       <w:r>
+        <w:t xml:space="preserve">~~Approve completed submissions~~ ✅ </w:t>
+      </w:r>
+      <w:r>
         <w:rPr>
           <w:b/>
         </w:rPr>
-        <w:t>Approve the legitimate completed submissions</w:t>
+        <w:t>Already done</w:t>
       </w:r>
       <w:r>
-        <w:t xml:space="preserve"> (so those participants are paid — an IRB obligation).</w:t>
+        <w:t xml:space="preserve"> (2 approved).</w:t>
       </w:r>
     </w:p>
     <w:p>
@@ -147,6 +178,23 @@
       </w:r>
       <w:r>
         <w:t xml:space="preserve"> (Finance page): https://app.prolific.com/researcher/workspaces/6a4e7265a79f3d33156014d0/finance</w:t>
+      </w:r>
+    </w:p>
+    <w:p>
+      <w:pPr>
+        <w:pStyle w:val="ListBullet"/>
+      </w:pPr>
+      <w:r>
+        <w:t xml:space="preserve">Before stopping, </w:t>
+      </w:r>
+      <w:r>
+        <w:rPr>
+          <w:b/>
+        </w:rPr>
+        <w:t>screenshot the study page</w:t>
+      </w:r>
+      <w:r>
+        <w:t xml:space="preserve"> showing "20 of 334,976 eligible" — that's citable evidence for the manuscript and the simulated-data conversation with Dr. Rey.</w:t>
       </w:r>
     </w:p>
     <w:p>

</xml_diff>